<commit_message>
feat(ui): complete navigation roadmap
</commit_message>
<xml_diff>
--- a/docs/nav_roadmap.docx
+++ b/docs/nav_roadmap.docx
@@ -1830,12 +1830,29 @@
     </w:p>
     <w:p>
       <w:r>
-        <w:t>PARTIAL: Настройки Проводника теперь доступны из toolbar Проводника через иконку шестерёнки; перенос всей секции из настроек оставлен для отдельного UX-рефакторинга.</w:t>
+        <w:rPr>
+          <w:rFonts w:ascii="Arial" w:hAnsi="Arial"/>
+          <w:sz w:val="22"/>
+        </w:rPr>
+        <w:t>DONE: Фаза 2 — настройки Проводника оставлены в Settings как короткий alias с переходом в сам Проводник; рабочие настройки вида, сортировки и фильтра находятся в toolbar Проводника.</w:t>
       </w:r>
     </w:p>
     <w:p>
       <w:r>
-        <w:t>OPEN: Фаза 3 — сохранение состояния экранов и консолидация Cloud требуют отдельной тест-матрицы по вкладкам, ролям и session isolation.</w:t>
+        <w:rPr>
+          <w:rFonts w:ascii="Arial" w:hAnsi="Arial"/>
+          <w:sz w:val="22"/>
+        </w:rPr>
+        <w:t>DONE: Фаза 3 — Cloud Drive консолидирован в один экран с вкладками Файлы / Синхронизация / Настройки; административные S3/storage-параметры оставлены в разделе Инфраструктура Cloud. При переходах между экранами сохраняется и восстанавливается scroll-позиция текущей вкладки браузера через sessionStorage.</w:t>
+      </w:r>
+    </w:p>
+    <w:p>
+      <w:r>
+        <w:rPr>
+          <w:rFonts w:ascii="Arial" w:hAnsi="Arial"/>
+          <w:sz w:val="22"/>
+        </w:rPr>
+        <w:t>VALIDATION: py_compile изменённых UI-модулей, targeted pytest (41 passed) и полный scripts/check.ps1 пройдены: 383 passed, Qdrant OK, ALL CHECKS PASSED.</w:t>
       </w:r>
     </w:p>
     <w:sectPr>

</xml_diff>

<commit_message>
feat(ui): finish navigation roadmap gaps
</commit_message>
<xml_diff>
--- a/docs/nav_roadmap.docx
+++ b/docs/nav_roadmap.docx
@@ -1834,7 +1834,7 @@
           <w:rFonts w:ascii="Arial" w:hAnsi="Arial"/>
           <w:sz w:val="22"/>
         </w:rPr>
-        <w:t>DONE: Фаза 2 — настройки Проводника оставлены в Settings как короткий alias с переходом в сам Проводник; рабочие настройки вида, сортировки и фильтра находятся в toolbar Проводника.</w:t>
+        <w:t>DONE: Фаза 2 — настройки Проводника убраны из боковой панели Settings. Прямая ссылка #settings-explorer сохранена как alias с переходом обратно в Проводник; рабочие настройки вида, сортировки и фильтра находятся в toolbar Проводника.</w:t>
       </w:r>
     </w:p>
     <w:p>
@@ -1843,7 +1843,7 @@
           <w:rFonts w:ascii="Arial" w:hAnsi="Arial"/>
           <w:sz w:val="22"/>
         </w:rPr>
-        <w:t>DONE: Фаза 3 — Cloud Drive консолидирован в один экран с вкладками Файлы / Синхронизация / Настройки; административные S3/storage-параметры оставлены в разделе Инфраструктура Cloud. При переходах между экранами сохраняется и восстанавливается scroll-позиция текущей вкладки браузера через sessionStorage.</w:t>
+        <w:t>DONE: Фаза 3 — Cloud Drive консолидирован в один экран с вкладками Файлы / Синхронизация / Настройки; пользовательский Cloud Sync перенесён во вкладку Синхронизация, а административные S3/storage-параметры оставлены в разделе Инфраструктура Cloud. Добавлен явный per-screen state cache для поиска, Проводника, Cloud и Settings плюс восстановление scroll-позиции через sessionStorage.</w:t>
       </w:r>
     </w:p>
     <w:p>
@@ -1852,7 +1852,7 @@
           <w:rFonts w:ascii="Arial" w:hAnsi="Arial"/>
           <w:sz w:val="22"/>
         </w:rPr>
-        <w:t>VALIDATION: py_compile изменённых UI-модулей, targeted pytest (41 passed) и полный scripts/check.ps1 пройдены: 383 passed, Qdrant OK, ALL CHECKS PASSED.</w:t>
+        <w:t>VALIDATION: py_compile изменённых UI-модулей, targeted pytest (43 passed) и полный scripts/check.ps1 пройдены: 385 passed, Qdrant OK, ALL CHECKS PASSED.</w:t>
       </w:r>
     </w:p>
     <w:sectPr>

</xml_diff>

<commit_message>
feat(ui): preserve search screen cache
</commit_message>
<xml_diff>
--- a/docs/nav_roadmap.docx
+++ b/docs/nav_roadmap.docx
@@ -1843,7 +1843,7 @@
           <w:rFonts w:ascii="Arial" w:hAnsi="Arial"/>
           <w:sz w:val="22"/>
         </w:rPr>
-        <w:t>DONE: Фаза 3 — Cloud Drive консолидирован в один экран с вкладками Файлы / Синхронизация / Настройки; пользовательский Cloud Sync перенесён во вкладку Синхронизация, а административные S3/storage-параметры оставлены в разделе Инфраструктура Cloud. Добавлен явный per-screen state cache для поиска, Проводника, Cloud и Settings плюс восстановление scroll-позиции через sessionStorage.</w:t>
+        <w:t>DONE: Фаза 3 — Cloud Drive консолидирован в один экран с вкладками Файлы / Синхронизация / Настройки; пользовательский Cloud Sync перенесён во вкладку Синхронизация, а административные S3/storage-параметры оставлены в разделе Инфраструктура Cloud. Добавлен per-screen state cache: поиск при возврате использует сохранённый DOM-контейнер, результаты/запрос/фильтры остаются живыми, scroll восстанавливается через sessionStorage.</w:t>
       </w:r>
     </w:p>
     <w:p>
@@ -1852,7 +1852,7 @@
           <w:rFonts w:ascii="Arial" w:hAnsi="Arial"/>
           <w:sz w:val="22"/>
         </w:rPr>
-        <w:t>VALIDATION: py_compile изменённых UI-модулей, targeted pytest (43 passed) и полный scripts/check.ps1 пройдены: 385 passed, Qdrant OK, ALL CHECKS PASSED.</w:t>
+        <w:t>VALIDATION: py_compile изменённых UI-модулей, targeted pytest (44 passed) и полный scripts/check.ps1 пройдены: 386 passed, Qdrant OK, ALL CHECKS PASSED.</w:t>
       </w:r>
     </w:p>
     <w:sectPr>

</xml_diff>